<commit_message>
Update roadmap: primer already read — compress ramp, accelerate plan
</commit_message>
<xml_diff>
--- a/plans/Exercise1_Roadmap.docx
+++ b/plans/Exercise1_Roadmap.docx
@@ -107,6 +107,31 @@
       </w:r>
       <w:r>
         <w:t xml:space="preserve"> matters more than the exact calendar. Confirm scope and the locus source with your PI in week one.</w:t>
+      </w:r>
+    </w:p>
+    <w:p>
+      <w:pPr>
+        <w:spacing w:after="120" w:line="276"/>
+      </w:pPr>
+      <w:r>
+        <w:rPr>
+          <w:b/>
+          <w:bCs/>
+        </w:rPr>
+        <w:t xml:space="preserve">Note. </w:t>
+      </w:r>
+      <w:r>
+        <w:t xml:space="preserve">This version assumes you have </w:t>
+      </w:r>
+      <w:r>
+        <w:rPr>
+          <w:i/>
+          <w:iCs/>
+        </w:rPr>
+        <w:t xml:space="preserve">already read the population-genetics primer</w:t>
+      </w:r>
+      <w:r>
+        <w:t xml:space="preserve">, so the concept ramp is removed and hands-on work starts in week one — putting you roughly a week ahead of a cold start.</w:t>
       </w:r>
     </w:p>
     <w:p>
@@ -344,7 +369,7 @@
         <w:t xml:space="preserve">Goal: </w:t>
       </w:r>
       <w:r>
-        <w:t xml:space="preserve">get the conceptual scaffolding in place, read the three core papers, install your tools, and produce a clean, versioned master table for the 10 pilot loci. This mirrors weeks 1–2 of the protocol timeline.</w:t>
+        <w:t xml:space="preserve">you’ve already read the primer, so skip the concept ramp. Go straight to the three core papers, stand up your tools, harmonize the 10 pilot loci, and end the fortnight with real 1000 Genomes allele frequencies in hand — roughly a week ahead of a cold start.</w:t>
       </w:r>
     </w:p>
     <w:tbl>
@@ -407,7 +432,7 @@
               <w:t xml:space="preserve">Start the data-access paperwork. </w:t>
             </w:r>
             <w:r>
-              <w:t xml:space="preserve">Talk to your PI and sponsored-programs office about an eRA Commons account and a dbGaP Data Access Request, and register interest in the All of Us Researcher Workbench. Approvals — not analysis — are the rate-limiting step of year one. Everything else this week can proceed in parallel while the queue moves.</w:t>
+              <w:t xml:space="preserve">For this project the resource to apply for is ADSP via NIAGADS DSS (the GRCh38 build) — talk to your PI and sponsored-programs office about an eRA Commons account and the data-use request, and ask whether the lab already holds ADSP/NIAGADS access. Approvals are the rate-limiting step of year one. You need none of it to start: 1000 Genomes is open, so the whole pilot proceeds in parallel while the queue moves.</w:t>
             </w:r>
           </w:p>
         </w:tc>
@@ -426,7 +451,7 @@
         <w:pStyle w:val="Heading2"/>
       </w:pPr>
       <w:r>
-        <w:t xml:space="preserve">Week 1 — Foundations and orientation</w:t>
+        <w:t xml:space="preserve">Week 1 — Papers, tooling, and starting the build</w:t>
       </w:r>
     </w:p>
     <w:p>
@@ -451,67 +476,67 @@
           <w:sz w:val="22"/>
           <w:szCs w:val="22"/>
         </w:rPr>
-        <w:t xml:space="preserve">  —  Setup + kick off data access</w:t>
-      </w:r>
-    </w:p>
-    <w:p>
-      <w:pPr>
-        <w:pStyle w:val="ListParagraph"/>
-        <w:numPr>
-          <w:ilvl w:val="0"/>
-          <w:numId w:val="2"/>
-        </w:numPr>
-        <w:spacing w:after="60" w:line="264"/>
-      </w:pPr>
-      <w:r>
-        <w:rPr>
-          <w:b/>
-          <w:bCs/>
-        </w:rPr>
-        <w:t xml:space="preserve">Start the data-access paperwork</w:t>
-      </w:r>
-      <w:r>
-        <w:t xml:space="preserve"> (see box above) — eRA Commons, dbGaP, All of Us.</w:t>
-      </w:r>
-    </w:p>
-    <w:p>
-      <w:pPr>
-        <w:pStyle w:val="ListParagraph"/>
-        <w:numPr>
-          <w:ilvl w:val="0"/>
-          <w:numId w:val="2"/>
-        </w:numPr>
-        <w:spacing w:after="60" w:line="264"/>
-      </w:pPr>
-      <w:r>
-        <w:rPr>
-          <w:b/>
-          <w:bCs/>
-        </w:rPr>
-        <w:t xml:space="preserve">Set up your workspace: </w:t>
-      </w:r>
-      <w:r>
-        <w:t xml:space="preserve">reference manager (Zotero), a versioned project folder, and a lab notebook / README file.</w:t>
-      </w:r>
-    </w:p>
-    <w:p>
-      <w:pPr>
-        <w:pStyle w:val="ListParagraph"/>
-        <w:numPr>
-          <w:ilvl w:val="0"/>
-          <w:numId w:val="2"/>
-        </w:numPr>
-        <w:spacing w:after="60" w:line="264"/>
-      </w:pPr>
-      <w:r>
-        <w:rPr>
-          <w:b/>
-          <w:bCs/>
-        </w:rPr>
-        <w:t xml:space="preserve">Read primer Ch. 1–2 </w:t>
-      </w:r>
-      <w:r>
-        <w:t xml:space="preserve">(Logic of Population Genetics; How Selection Leaves Footprints). Do the check-your-understanding questions.</w:t>
+        <w:t xml:space="preserve">  —  Data access + environment live</w:t>
+      </w:r>
+    </w:p>
+    <w:p>
+      <w:pPr>
+        <w:pStyle w:val="ListParagraph"/>
+        <w:numPr>
+          <w:ilvl w:val="0"/>
+          <w:numId w:val="2"/>
+        </w:numPr>
+        <w:spacing w:after="60" w:line="264"/>
+      </w:pPr>
+      <w:r>
+        <w:rPr>
+          <w:b/>
+          <w:bCs/>
+        </w:rPr>
+        <w:t xml:space="preserve">Start the ADSP/NIAGADS paperwork </w:t>
+      </w:r>
+      <w:r>
+        <w:t xml:space="preserve">(see box above) — the AD-specific resource; 1000 Genomes itself needs no application.</w:t>
+      </w:r>
+    </w:p>
+    <w:p>
+      <w:pPr>
+        <w:pStyle w:val="ListParagraph"/>
+        <w:numPr>
+          <w:ilvl w:val="0"/>
+          <w:numId w:val="2"/>
+        </w:numPr>
+        <w:spacing w:after="60" w:line="264"/>
+      </w:pPr>
+      <w:r>
+        <w:rPr>
+          <w:b/>
+          <w:bCs/>
+        </w:rPr>
+        <w:t xml:space="preserve">Create the conda environment </w:t>
+      </w:r>
+      <w:r>
+        <w:t xml:space="preserve">(environment.yml) and smoke-test the pipeline: run scripts/00_get_1000g.sh to pull the APOE region. First real data on Day 1.</w:t>
+      </w:r>
+    </w:p>
+    <w:p>
+      <w:pPr>
+        <w:pStyle w:val="ListParagraph"/>
+        <w:numPr>
+          <w:ilvl w:val="0"/>
+          <w:numId w:val="2"/>
+        </w:numPr>
+        <w:spacing w:after="60" w:line="264"/>
+      </w:pPr>
+      <w:r>
+        <w:rPr>
+          <w:b/>
+          <w:bCs/>
+        </w:rPr>
+        <w:t xml:space="preserve">Refresh, don’t re-read: </w:t>
+      </w:r>
+      <w:r>
+        <w:t xml:space="preserve">rebuild the primer’s statistic → footprint → timescale table from memory — it becomes your working reference.</w:t>
       </w:r>
     </w:p>
     <w:p>
@@ -536,67 +561,47 @@
           <w:sz w:val="22"/>
           <w:szCs w:val="22"/>
         </w:rPr>
-        <w:t xml:space="preserve">  —  The data views and the statistics</w:t>
-      </w:r>
-    </w:p>
-    <w:p>
-      <w:pPr>
-        <w:pStyle w:val="ListParagraph"/>
-        <w:numPr>
-          <w:ilvl w:val="0"/>
-          <w:numId w:val="2"/>
-        </w:numPr>
-        <w:spacing w:after="60" w:line="264"/>
-      </w:pPr>
-      <w:r>
-        <w:rPr>
-          <w:b/>
-          <w:bCs/>
-        </w:rPr>
-        <w:t xml:space="preserve">Read primer Ch. 3–4 </w:t>
-      </w:r>
-      <w:r>
-        <w:t xml:space="preserve">(Two Views of the Data; The Statistics, Decoded).</w:t>
-      </w:r>
-    </w:p>
-    <w:p>
-      <w:pPr>
-        <w:pStyle w:val="ListParagraph"/>
-        <w:numPr>
-          <w:ilvl w:val="0"/>
-          <w:numId w:val="2"/>
-        </w:numPr>
-        <w:spacing w:after="60" w:line="264"/>
-      </w:pPr>
-      <w:r>
-        <w:rPr>
-          <w:b/>
-          <w:bCs/>
-        </w:rPr>
-        <w:t xml:space="preserve">Build the reference table the protocol asks for: </w:t>
-      </w:r>
-      <w:r>
-        <w:t xml:space="preserve">statistic → footprint it reads → timescale it detects. Keep it one page.</w:t>
-      </w:r>
-    </w:p>
-    <w:p>
-      <w:pPr>
-        <w:pStyle w:val="ListParagraph"/>
-        <w:numPr>
-          <w:ilvl w:val="0"/>
-          <w:numId w:val="2"/>
-        </w:numPr>
-        <w:spacing w:after="60" w:line="264"/>
-      </w:pPr>
-      <w:r>
-        <w:rPr>
-          <w:b/>
-          <w:bCs/>
-        </w:rPr>
-        <w:t xml:space="preserve">Install your toolkit: </w:t>
-      </w:r>
-      <w:r>
-        <w:t xml:space="preserve">bcftools, PLINK2, a Python env with scikit-allel, and R with LDlinkR.</w:t>
+        <w:t xml:space="preserve">  —  Paper 1 — Vitti, Grossman &amp; Sabeti (2013)</w:t>
+      </w:r>
+    </w:p>
+    <w:p>
+      <w:pPr>
+        <w:pStyle w:val="ListParagraph"/>
+        <w:numPr>
+          <w:ilvl w:val="0"/>
+          <w:numId w:val="2"/>
+        </w:numPr>
+        <w:spacing w:after="60" w:line="264"/>
+      </w:pPr>
+      <w:r>
+        <w:rPr>
+          <w:b/>
+          <w:bCs/>
+        </w:rPr>
+        <w:t xml:space="preserve">Read fast, for the map not the algebra. </w:t>
+      </w:r>
+      <w:r>
+        <w:t xml:space="preserve">You know the concepts; mine it for the catalogue of footprints and statistics.</w:t>
+      </w:r>
+    </w:p>
+    <w:p>
+      <w:pPr>
+        <w:pStyle w:val="ListParagraph"/>
+        <w:numPr>
+          <w:ilvl w:val="0"/>
+          <w:numId w:val="2"/>
+        </w:numPr>
+        <w:spacing w:after="60" w:line="264"/>
+      </w:pPr>
+      <w:r>
+        <w:rPr>
+          <w:b/>
+          <w:bCs/>
+        </w:rPr>
+        <w:t xml:space="preserve">Finalize your statistic → footprint → timescale table </w:t>
+      </w:r>
+      <w:r>
+        <w:t xml:space="preserve">against the paper — your reference for the whole project.</w:t>
       </w:r>
     </w:p>
     <w:p>
@@ -621,47 +626,47 @@
           <w:sz w:val="22"/>
           <w:szCs w:val="22"/>
         </w:rPr>
-        <w:t xml:space="preserve">  —  Demography and the hard cases</w:t>
-      </w:r>
-    </w:p>
-    <w:p>
-      <w:pPr>
-        <w:pStyle w:val="ListParagraph"/>
-        <w:numPr>
-          <w:ilvl w:val="0"/>
-          <w:numId w:val="2"/>
-        </w:numPr>
-        <w:spacing w:after="60" w:line="264"/>
-      </w:pPr>
-      <w:r>
-        <w:rPr>
-          <w:b/>
-          <w:bCs/>
-        </w:rPr>
-        <w:t xml:space="preserve">Read primer Ch. 5–6 </w:t>
-      </w:r>
-      <w:r>
-        <w:t xml:space="preserve">(Demography: the great impostor; Recent and polygenic selection) plus Ch. 7 and the glossary.</w:t>
-      </w:r>
-    </w:p>
-    <w:p>
-      <w:pPr>
-        <w:pStyle w:val="ListParagraph"/>
-        <w:numPr>
-          <w:ilvl w:val="0"/>
-          <w:numId w:val="2"/>
-        </w:numPr>
-        <w:spacing w:after="60" w:line="264"/>
-      </w:pPr>
-      <w:r>
-        <w:rPr>
-          <w:b/>
-          <w:bCs/>
-        </w:rPr>
-        <w:t xml:space="preserve">Write a half-page in your own words: </w:t>
-      </w:r>
-      <w:r>
-        <w:t xml:space="preserve">why demography mimics selection, and the two escape routes (matched genome-wide background; explicit demographic modelling).</w:t>
+        <w:t xml:space="preserve">  —  Paper 2 — Cheng &amp; Steinrücken (2024)</w:t>
+      </w:r>
+    </w:p>
+    <w:p>
+      <w:pPr>
+        <w:pStyle w:val="ListParagraph"/>
+        <w:numPr>
+          <w:ilvl w:val="0"/>
+          <w:numId w:val="2"/>
+        </w:numPr>
+        <w:spacing w:after="60" w:line="264"/>
+      </w:pPr>
+      <w:r>
+        <w:rPr>
+          <w:b/>
+          <w:bCs/>
+        </w:rPr>
+        <w:t xml:space="preserve">One focused pass. </w:t>
+      </w:r>
+      <w:r>
+        <w:t xml:space="preserve">The coalescent and demography-vs-selection logic you already have, so read for the modern methods and the tool names you’ll use: Relate, tsinfer/tsdate, dadi, PSMC/MSMC, S/HIC.</w:t>
+      </w:r>
+    </w:p>
+    <w:p>
+      <w:pPr>
+        <w:pStyle w:val="ListParagraph"/>
+        <w:numPr>
+          <w:ilvl w:val="0"/>
+          <w:numId w:val="2"/>
+        </w:numPr>
+        <w:spacing w:after="60" w:line="264"/>
+      </w:pPr>
+      <w:r>
+        <w:rPr>
+          <w:b/>
+          <w:bCs/>
+        </w:rPr>
+        <w:t xml:space="preserve">Note which tool maps to which stage </w:t>
+      </w:r>
+      <w:r>
+        <w:t xml:space="preserve">of your project, in your README.</w:t>
       </w:r>
     </w:p>
     <w:p>
@@ -686,47 +691,47 @@
           <w:sz w:val="22"/>
           <w:szCs w:val="22"/>
         </w:rPr>
-        <w:t xml:space="preserve">  —  Paper 1 — Vitti, Grossman &amp; Sabeti (2013)</w:t>
-      </w:r>
-    </w:p>
-    <w:p>
-      <w:pPr>
-        <w:pStyle w:val="ListParagraph"/>
-        <w:numPr>
-          <w:ilvl w:val="0"/>
-          <w:numId w:val="2"/>
-        </w:numPr>
-        <w:spacing w:after="60" w:line="264"/>
-      </w:pPr>
-      <w:r>
-        <w:rPr>
-          <w:b/>
-          <w:bCs/>
-        </w:rPr>
-        <w:t xml:space="preserve">Read for the map, not the algebra. </w:t>
-      </w:r>
-      <w:r>
-        <w:t xml:space="preserve">This is your catalogue of footprints and statistics.</w:t>
-      </w:r>
-    </w:p>
-    <w:p>
-      <w:pPr>
-        <w:pStyle w:val="ListParagraph"/>
-        <w:numPr>
-          <w:ilvl w:val="0"/>
-          <w:numId w:val="2"/>
-        </w:numPr>
-        <w:spacing w:after="60" w:line="264"/>
-      </w:pPr>
-      <w:r>
-        <w:rPr>
-          <w:b/>
-          <w:bCs/>
-        </w:rPr>
-        <w:t xml:space="preserve">Extend your statistic → footprint → timescale table </w:t>
-      </w:r>
-      <w:r>
-        <w:t xml:space="preserve">as you go. When it’s complete, it’s your working reference for the whole project.</w:t>
+        <w:t xml:space="preserve">  —  Paper 3 — Mills &amp; Mathieson (2022) + PI check-in</w:t>
+      </w:r>
+    </w:p>
+    <w:p>
+      <w:pPr>
+        <w:pStyle w:val="ListParagraph"/>
+        <w:numPr>
+          <w:ilvl w:val="0"/>
+          <w:numId w:val="2"/>
+        </w:numPr>
+        <w:spacing w:after="60" w:line="264"/>
+      </w:pPr>
+      <w:r>
+        <w:rPr>
+          <w:b/>
+          <w:bCs/>
+        </w:rPr>
+        <w:t xml:space="preserve">Read for failure modes: </w:t>
+      </w:r>
+      <w:r>
+        <w:t xml:space="preserve">the height-selection retraction, polygenic selection, stratification, ancient DNA. Lock in the reviewer reflex.</w:t>
+      </w:r>
+    </w:p>
+    <w:p>
+      <w:pPr>
+        <w:pStyle w:val="ListParagraph"/>
+        <w:numPr>
+          <w:ilvl w:val="0"/>
+          <w:numId w:val="2"/>
+        </w:numPr>
+        <w:spacing w:after="60" w:line="264"/>
+      </w:pPr>
+      <w:r>
+        <w:rPr>
+          <w:b/>
+          <w:bCs/>
+        </w:rPr>
+        <w:t xml:space="preserve">Meet your PI: </w:t>
+      </w:r>
+      <w:r>
+        <w:t xml:space="preserve">confirm the locus source (Bellenguez 2026 supplement), the pilot scope, and whether the lab already holds ADSP/NIAGADS access.</w:t>
       </w:r>
     </w:p>
     <w:p>
@@ -751,47 +756,47 @@
           <w:sz w:val="22"/>
           <w:szCs w:val="22"/>
         </w:rPr>
-        <w:t xml:space="preserve">  —  Finish Vitti + first PI check-in + test the data</w:t>
-      </w:r>
-    </w:p>
-    <w:p>
-      <w:pPr>
-        <w:pStyle w:val="ListParagraph"/>
-        <w:numPr>
-          <w:ilvl w:val="0"/>
-          <w:numId w:val="2"/>
-        </w:numPr>
-        <w:spacing w:after="60" w:line="264"/>
-      </w:pPr>
-      <w:r>
-        <w:rPr>
-          <w:b/>
-          <w:bCs/>
-        </w:rPr>
-        <w:t xml:space="preserve">Finish Vitti. </w:t>
-      </w:r>
-      <w:r>
-        <w:t xml:space="preserve">Meet your PI/mentor: confirm the locus source (Bellenguez 2026 supplement) and the pilot scope.</w:t>
-      </w:r>
-    </w:p>
-    <w:p>
-      <w:pPr>
-        <w:pStyle w:val="ListParagraph"/>
-        <w:numPr>
-          <w:ilvl w:val="0"/>
-          <w:numId w:val="2"/>
-        </w:numPr>
-        <w:spacing w:after="60" w:line="264"/>
-      </w:pPr>
-      <w:r>
-        <w:rPr>
-          <w:b/>
-          <w:bCs/>
-        </w:rPr>
-        <w:t xml:space="preserve">Locate the 1000 Genomes high-coverage data </w:t>
-      </w:r>
-      <w:r>
-        <w:t xml:space="preserve">and run bcftools on one chromosome as a smoke test (chr19 is a good choice — it carries APOE).</w:t>
+        <w:t xml:space="preserve">  —  Master table schema + extract pilot loci</w:t>
+      </w:r>
+    </w:p>
+    <w:p>
+      <w:pPr>
+        <w:pStyle w:val="ListParagraph"/>
+        <w:numPr>
+          <w:ilvl w:val="0"/>
+          <w:numId w:val="2"/>
+        </w:numPr>
+        <w:spacing w:after="60" w:line="264"/>
+      </w:pPr>
+      <w:r>
+        <w:rPr>
+          <w:b/>
+          <w:bCs/>
+        </w:rPr>
+        <w:t xml:space="preserve">Pull the Bellenguez 2026 supplementary tables </w:t>
+      </w:r>
+      <w:r>
+        <w:t xml:space="preserve">into data/raw/.</w:t>
+      </w:r>
+    </w:p>
+    <w:p>
+      <w:pPr>
+        <w:pStyle w:val="ListParagraph"/>
+        <w:numPr>
+          <w:ilvl w:val="0"/>
+          <w:numId w:val="2"/>
+        </w:numPr>
+        <w:spacing w:after="60" w:line="264"/>
+      </w:pPr>
+      <w:r>
+        <w:rPr>
+          <w:b/>
+          <w:bCs/>
+        </w:rPr>
+        <w:t xml:space="preserve">Build the master table schema </w:t>
+      </w:r>
+      <w:r>
+        <w:t xml:space="preserve">(protocol §18) and extract the 10 pilot lead SNPs (APOE/TOMM40, BIN1, CLU, ABCA7, TREM2, CR1, MS4A, SORL1, INPP5D, HLA) into it.</w:t>
       </w:r>
     </w:p>
     <w:p>
@@ -806,7 +811,7 @@
         <w:t xml:space="preserve">Weekend (light): </w:t>
       </w:r>
       <w:r>
-        <w:t xml:space="preserve">skim Coop’s open-access lecture notes for any shaky concept (drift, LD, coalescent). Read Williams (1957) on pleiotropy and senescence — short, and central to your framing.</w:t>
+        <w:t xml:space="preserve">optional — Shi &amp; Holtzman (2018) on innate immunity and Alzheimer’s (APOE, TREM2); skim Williams (1957) on pleiotropy and senescence if you haven’t.</w:t>
       </w:r>
     </w:p>
     <w:p>
@@ -814,7 +819,7 @@
         <w:pStyle w:val="Heading2"/>
       </w:pPr>
       <w:r>
-        <w:t xml:space="preserve">Week 2 — The methods papers and your first master table</w:t>
+        <w:t xml:space="preserve">Week 2 — Hands-on: harmonize and get real frequencies</w:t>
       </w:r>
     </w:p>
     <w:p>
@@ -839,47 +844,47 @@
           <w:sz w:val="22"/>
           <w:szCs w:val="22"/>
         </w:rPr>
-        <w:t xml:space="preserve">  —  Paper 2 — Cheng &amp; Steinrücken (2024), pass 1</w:t>
-      </w:r>
-    </w:p>
-    <w:p>
-      <w:pPr>
-        <w:pStyle w:val="ListParagraph"/>
-        <w:numPr>
-          <w:ilvl w:val="0"/>
-          <w:numId w:val="2"/>
-        </w:numPr>
-        <w:spacing w:after="60" w:line="264"/>
-      </w:pPr>
-      <w:r>
-        <w:rPr>
-          <w:b/>
-          <w:bCs/>
-        </w:rPr>
-        <w:t xml:space="preserve">Read for concepts: </w:t>
-      </w:r>
-      <w:r>
-        <w:t xml:space="preserve">the coalescent, the demography-vs-selection problem, and why a selection scan needs a demographic null.</w:t>
-      </w:r>
-    </w:p>
-    <w:p>
-      <w:pPr>
-        <w:pStyle w:val="ListParagraph"/>
-        <w:numPr>
-          <w:ilvl w:val="0"/>
-          <w:numId w:val="2"/>
-        </w:numPr>
-        <w:spacing w:after="60" w:line="264"/>
-      </w:pPr>
-      <w:r>
-        <w:rPr>
-          <w:b/>
-          <w:bCs/>
-        </w:rPr>
-        <w:t xml:space="preserve">Pull the Bellenguez 2026 supplementary tables </w:t>
-      </w:r>
-      <w:r>
-        <w:t xml:space="preserve">and get familiar with their columns.</w:t>
+        <w:t xml:space="preserve">  —  Allele harmonization</w:t>
+      </w:r>
+    </w:p>
+    <w:p>
+      <w:pPr>
+        <w:pStyle w:val="ListParagraph"/>
+        <w:numPr>
+          <w:ilvl w:val="0"/>
+          <w:numId w:val="2"/>
+        </w:numPr>
+        <w:spacing w:after="60" w:line="264"/>
+      </w:pPr>
+      <w:r>
+        <w:rPr>
+          <w:b/>
+          <w:bCs/>
+        </w:rPr>
+        <w:t xml:space="preserve">Harmonize each pilot locus: </w:t>
+      </w:r>
+      <w:r>
+        <w:t xml:space="preserve">rsID → chr:pos:REF:ALT in GRCh38 via Ensembl/VEP; record effect allele and risk allele from the source.</w:t>
+      </w:r>
+    </w:p>
+    <w:p>
+      <w:pPr>
+        <w:pStyle w:val="ListParagraph"/>
+        <w:numPr>
+          <w:ilvl w:val="0"/>
+          <w:numId w:val="2"/>
+        </w:numPr>
+        <w:spacing w:after="60" w:line="264"/>
+      </w:pPr>
+      <w:r>
+        <w:rPr>
+          <w:b/>
+          <w:bCs/>
+        </w:rPr>
+        <w:t xml:space="preserve">Flag the traps: </w:t>
+      </w:r>
+      <w:r>
+        <w:t xml:space="preserve">palindromic (A/T, C/G) SNPs, multi-allelic sites, indels, merged/split rsIDs. Flag rather than guess.</w:t>
       </w:r>
     </w:p>
     <w:p>
@@ -904,47 +909,47 @@
           <w:sz w:val="22"/>
           <w:szCs w:val="22"/>
         </w:rPr>
-        <w:t xml:space="preserve">  —  Cheng &amp; Steinrücken pass 2 + build the table schema</w:t>
-      </w:r>
-    </w:p>
-    <w:p>
-      <w:pPr>
-        <w:pStyle w:val="ListParagraph"/>
-        <w:numPr>
-          <w:ilvl w:val="0"/>
-          <w:numId w:val="2"/>
-        </w:numPr>
-        <w:spacing w:after="60" w:line="264"/>
-      </w:pPr>
-      <w:r>
-        <w:rPr>
-          <w:b/>
-          <w:bCs/>
-        </w:rPr>
-        <w:t xml:space="preserve">Second pass for tool names </w:t>
-      </w:r>
-      <w:r>
-        <w:t xml:space="preserve">you’ll actually use: Relate, tsinfer/tsdate, dadi, PSMC/MSMC, S/HIC.</w:t>
-      </w:r>
-    </w:p>
-    <w:p>
-      <w:pPr>
-        <w:pStyle w:val="ListParagraph"/>
-        <w:numPr>
-          <w:ilvl w:val="0"/>
-          <w:numId w:val="2"/>
-        </w:numPr>
-        <w:spacing w:after="60" w:line="264"/>
-      </w:pPr>
-      <w:r>
-        <w:rPr>
-          <w:b/>
-          <w:bCs/>
-        </w:rPr>
-        <w:t xml:space="preserve">Set up your master locus table schema </w:t>
-      </w:r>
-      <w:r>
-        <w:t xml:space="preserve">from protocol Section 18 (locus_id, lead_snp, variant_id_GRCh38, risk_allele_harmonized, source_GWAS, phenotype_class, candidate_gene, consequence, qc_flags).</w:t>
+        <w:t xml:space="preserve">  —  Audit, freeze v1, populate regions</w:t>
+      </w:r>
+    </w:p>
+    <w:p>
+      <w:pPr>
+        <w:pStyle w:val="ListParagraph"/>
+        <w:numPr>
+          <w:ilvl w:val="0"/>
+          <w:numId w:val="2"/>
+        </w:numPr>
+        <w:spacing w:after="60" w:line="264"/>
+      </w:pPr>
+      <w:r>
+        <w:rPr>
+          <w:b/>
+          <w:bCs/>
+        </w:rPr>
+        <w:t xml:space="preserve">Audit the harmonization twice; </w:t>
+      </w:r>
+      <w:r>
+        <w:t xml:space="preserve">compare reported effect-allele frequency against 1000G EUR.</w:t>
+      </w:r>
+    </w:p>
+    <w:p>
+      <w:pPr>
+        <w:pStyle w:val="ListParagraph"/>
+        <w:numPr>
+          <w:ilvl w:val="0"/>
+          <w:numId w:val="2"/>
+        </w:numPr>
+        <w:spacing w:after="60" w:line="264"/>
+      </w:pPr>
+      <w:r>
+        <w:rPr>
+          <w:b/>
+          <w:bCs/>
+        </w:rPr>
+        <w:t xml:space="preserve">Freeze master_table_v1 </w:t>
+      </w:r>
+      <w:r>
+        <w:t xml:space="preserve">in results/, and populate refs/pilot_regions.tsv with each locus’s coordinates.</w:t>
       </w:r>
     </w:p>
     <w:p>
@@ -969,47 +974,27 @@
           <w:sz w:val="22"/>
           <w:szCs w:val="22"/>
         </w:rPr>
-        <w:t xml:space="preserve">  —  Paper 3 — Mills &amp; Mathieson (2022) + extract pilot loci</w:t>
-      </w:r>
-    </w:p>
-    <w:p>
-      <w:pPr>
-        <w:pStyle w:val="ListParagraph"/>
-        <w:numPr>
-          <w:ilvl w:val="0"/>
-          <w:numId w:val="2"/>
-        </w:numPr>
-        <w:spacing w:after="60" w:line="264"/>
-      </w:pPr>
-      <w:r>
-        <w:rPr>
-          <w:b/>
-          <w:bCs/>
-        </w:rPr>
-        <w:t xml:space="preserve">Read for failure modes: </w:t>
-      </w:r>
-      <w:r>
-        <w:t xml:space="preserve">the height-selection retraction, polygenic selection, stratification, why ancient DNA matters.</w:t>
-      </w:r>
-    </w:p>
-    <w:p>
-      <w:pPr>
-        <w:pStyle w:val="ListParagraph"/>
-        <w:numPr>
-          <w:ilvl w:val="0"/>
-          <w:numId w:val="2"/>
-        </w:numPr>
-        <w:spacing w:after="60" w:line="264"/>
-      </w:pPr>
-      <w:r>
-        <w:rPr>
-          <w:b/>
-          <w:bCs/>
-        </w:rPr>
-        <w:t xml:space="preserve">Extract the 10 pilot loci </w:t>
-      </w:r>
-      <w:r>
-        <w:t xml:space="preserve">(APOE/TOMM40, BIN1, CLU, ABCA7, TREM2, CR1, MS4A, SORL1, INPP5D, HLA) into the master table.</w:t>
+        <w:t xml:space="preserve">  —  Pull 1000G data for all pilot loci</w:t>
+      </w:r>
+    </w:p>
+    <w:p>
+      <w:pPr>
+        <w:pStyle w:val="ListParagraph"/>
+        <w:numPr>
+          <w:ilvl w:val="0"/>
+          <w:numId w:val="2"/>
+        </w:numPr>
+        <w:spacing w:after="60" w:line="264"/>
+      </w:pPr>
+      <w:r>
+        <w:rPr>
+          <w:b/>
+          <w:bCs/>
+        </w:rPr>
+        <w:t xml:space="preserve">Run scripts/00_get_1000g.sh </w:t>
+      </w:r>
+      <w:r>
+        <w:t xml:space="preserve">across the full pilot_regions.tsv; verify each region VCF and the sample → population panel.</w:t>
       </w:r>
     </w:p>
     <w:p>
@@ -1034,47 +1019,47 @@
           <w:sz w:val="22"/>
           <w:szCs w:val="22"/>
         </w:rPr>
-        <w:t xml:space="preserve">  —  Allele harmonization</w:t>
-      </w:r>
-    </w:p>
-    <w:p>
-      <w:pPr>
-        <w:pStyle w:val="ListParagraph"/>
-        <w:numPr>
-          <w:ilvl w:val="0"/>
-          <w:numId w:val="2"/>
-        </w:numPr>
-        <w:spacing w:after="60" w:line="264"/>
-      </w:pPr>
-      <w:r>
-        <w:rPr>
-          <w:b/>
-          <w:bCs/>
-        </w:rPr>
-        <w:t xml:space="preserve">Harmonize each pilot locus: </w:t>
-      </w:r>
-      <w:r>
-        <w:t xml:space="preserve">rsID → chr:pos:REF:ALT in GRCh38 via Ensembl/VEP; record effect allele and risk allele from the source.</w:t>
-      </w:r>
-    </w:p>
-    <w:p>
-      <w:pPr>
-        <w:pStyle w:val="ListParagraph"/>
-        <w:numPr>
-          <w:ilvl w:val="0"/>
-          <w:numId w:val="2"/>
-        </w:numPr>
-        <w:spacing w:after="60" w:line="264"/>
-      </w:pPr>
-      <w:r>
-        <w:rPr>
-          <w:b/>
-          <w:bCs/>
-        </w:rPr>
-        <w:t xml:space="preserve">Flag the traps: </w:t>
-      </w:r>
-      <w:r>
-        <w:t xml:space="preserve">palindromic (A/T, C/G) SNPs, multi-allelic sites, indels, merged/split rsIDs. Flag rather than guess.</w:t>
+        <w:t xml:space="preserve">  —  First allele-frequency analysis</w:t>
+      </w:r>
+    </w:p>
+    <w:p>
+      <w:pPr>
+        <w:pStyle w:val="ListParagraph"/>
+        <w:numPr>
+          <w:ilvl w:val="0"/>
+          <w:numId w:val="2"/>
+        </w:numPr>
+        <w:spacing w:after="60" w:line="264"/>
+      </w:pPr>
+      <w:r>
+        <w:rPr>
+          <w:b/>
+          <w:bCs/>
+        </w:rPr>
+        <w:t xml:space="preserve">Write scripts/02_allele_frequencies.py: </w:t>
+      </w:r>
+      <w:r>
+        <w:t xml:space="preserve">risk-allele AF per super-population (AFR/EUR/EAS/SAS/AMR), ΔAF, and rare/missingness flags.</w:t>
+      </w:r>
+    </w:p>
+    <w:p>
+      <w:pPr>
+        <w:pStyle w:val="ListParagraph"/>
+        <w:numPr>
+          <w:ilvl w:val="0"/>
+          <w:numId w:val="2"/>
+        </w:numPr>
+        <w:spacing w:after="60" w:line="264"/>
+      </w:pPr>
+      <w:r>
+        <w:rPr>
+          <w:b/>
+          <w:bCs/>
+        </w:rPr>
+        <w:t xml:space="preserve">Treat ΔAF as a descriptive flag, </w:t>
+      </w:r>
+      <w:r>
+        <w:t xml:space="preserve">not a test of selection.</w:t>
       </w:r>
     </w:p>
     <w:p>
@@ -1099,47 +1084,27 @@
           <w:sz w:val="22"/>
           <w:szCs w:val="22"/>
         </w:rPr>
-        <w:t xml:space="preserve">  —  Audit, freeze v1, checkpoint</w:t>
-      </w:r>
-    </w:p>
-    <w:p>
-      <w:pPr>
-        <w:pStyle w:val="ListParagraph"/>
-        <w:numPr>
-          <w:ilvl w:val="0"/>
-          <w:numId w:val="2"/>
-        </w:numPr>
-        <w:spacing w:after="60" w:line="264"/>
-      </w:pPr>
-      <w:r>
-        <w:rPr>
-          <w:b/>
-          <w:bCs/>
-        </w:rPr>
-        <w:t xml:space="preserve">Finish and audit </w:t>
-      </w:r>
-      <w:r>
-        <w:t xml:space="preserve">the 10-locus harmonization twice; compare reported effect-allele frequency against 1000G EUR.</w:t>
-      </w:r>
-    </w:p>
-    <w:p>
-      <w:pPr>
-        <w:pStyle w:val="ListParagraph"/>
-        <w:numPr>
-          <w:ilvl w:val="0"/>
-          <w:numId w:val="2"/>
-        </w:numPr>
-        <w:spacing w:after="60" w:line="264"/>
-      </w:pPr>
-      <w:r>
-        <w:rPr>
-          <w:b/>
-          <w:bCs/>
-        </w:rPr>
-        <w:t xml:space="preserve">Freeze master table v1 </w:t>
-      </w:r>
-      <w:r>
-        <w:t xml:space="preserve">with a version number and an audit note.</w:t>
+        <w:t xml:space="preserve">  —  First plots + checkpoint</w:t>
+      </w:r>
+    </w:p>
+    <w:p>
+      <w:pPr>
+        <w:pStyle w:val="ListParagraph"/>
+        <w:numPr>
+          <w:ilvl w:val="0"/>
+          <w:numId w:val="2"/>
+        </w:numPr>
+        <w:spacing w:after="60" w:line="264"/>
+      </w:pPr>
+      <w:r>
+        <w:rPr>
+          <w:b/>
+          <w:bCs/>
+        </w:rPr>
+        <w:t xml:space="preserve">Plot per-population frequencies </w:t>
+      </w:r>
+      <w:r>
+        <w:t xml:space="preserve">for the 10 loci; write a dated notebook entry.</w:t>
       </w:r>
     </w:p>
     <w:p>
@@ -1159,7 +1124,7 @@
         <w:t xml:space="preserve">Two-week checkpoint: </w:t>
       </w:r>
       <w:r>
-        <w:t xml:space="preserve">core reading done, toolkit working, clean pilot master table in hand. Write a short progress note for your PI.</w:t>
+        <w:t xml:space="preserve">papers read, environment live, master_table_v1 frozen, and real 1000G frequencies computed for all pilot loci — about a week ahead of the original plan. Send your PI a short progress note.</w:t>
       </w:r>
     </w:p>
     <w:p>
@@ -1171,10 +1136,10 @@
           <w:i/>
           <w:iCs/>
         </w:rPr>
-        <w:t xml:space="preserve">Weekend (light): </w:t>
-      </w:r>
-      <w:r>
-        <w:t xml:space="preserve">rest. Optional: Shi &amp; Holtzman (2018) on innate immunity and Alzheimer’s (APOE, TREM2) — good bridge to your disease-biology side.</w:t>
+        <w:t xml:space="preserve">Weekend: </w:t>
+      </w:r>
+      <w:r>
+        <w:t xml:space="preserve">rest.</w:t>
       </w:r>
     </w:p>
     <w:p>
@@ -1202,7 +1167,7 @@
         <w:t xml:space="preserve">Goal: </w:t>
       </w:r>
       <w:r>
-        <w:t xml:space="preserve">turn the pilot into a working, reproducible pipeline, complete all analyses on the 10 pilot loci, then scale to all 91. This is weeks 3–8 of the protocol timeline, plus a scale-up phase.</w:t>
+        <w:t xml:space="preserve">with pilot frequencies already done in week 2, use the head start to move through LD, selection annotation, functional annotation, and sensitivity analyses, scale to all 91 loci, and begin the modern (ARG / demographic) toolkit earlier than a cold start would allow.</w:t>
       </w:r>
     </w:p>
     <w:tbl>
@@ -1392,7 +1357,7 @@
                 <w:sz w:val="19"/>
                 <w:szCs w:val="19"/>
               </w:rPr>
-              <w:t xml:space="preserve">1000 Genomes allele frequencies for pilot loci (then all 91 if the pipeline holds). Compute risk-allele AF per super-population, ΔAF, rare/missingness flags.</w:t>
+              <w:t xml:space="preserve">Ancestry-specific LD and portability for the pilot loci: retrieve proxies (r²≥0.8 and ≥0.6) across EUR/AFR/EAS/SAS/AMR and classify portable / partial / non-portable. In parallel, scale the frequency step to all 91 loci.</w:t>
             </w:r>
           </w:p>
         </w:tc>
@@ -1425,7 +1390,7 @@
                 <w:sz w:val="19"/>
                 <w:szCs w:val="19"/>
               </w:rPr>
-              <w:t xml:space="preserve">Frequency table with ΔAF columns; first plots.</w:t>
+              <w:t xml:space="preserve">LD portability summary; frequencies for all 91.</w:t>
             </w:r>
           </w:p>
         </w:tc>
@@ -1496,7 +1461,7 @@
                 <w:sz w:val="19"/>
                 <w:szCs w:val="19"/>
               </w:rPr>
-              <w:t xml:space="preserve">Ancestry-specific LD and portability. For each lead SNP, retrieve proxies (r²≥0.8 and ≥0.6) across EUR/AFR/EAS/SAS/AMR; classify portable / partially / non-portable.</w:t>
+              <w:t xml:space="preserve">Precomputed selection annotation (1000G Selection Browser, PopHumanScan). Windows ±50/100/250/500 kb. Run positive controls (LCT, EDAR, SLC24A5, DARC) to prove the pipeline recovers known signals.</w:t>
             </w:r>
           </w:p>
         </w:tc>
@@ -1529,7 +1494,7 @@
                 <w:sz w:val="19"/>
                 <w:szCs w:val="19"/>
               </w:rPr>
-              <w:t xml:space="preserve">LD portability summary by population.</w:t>
+              <w:t xml:space="preserve">Selection-evidence table with caveat flags; controls recovered.</w:t>
             </w:r>
           </w:p>
         </w:tc>
@@ -1600,7 +1565,7 @@
                 <w:sz w:val="19"/>
                 <w:szCs w:val="19"/>
               </w:rPr>
-              <w:t xml:space="preserve">Precomputed selection annotation (1000G Selection Browser, PopHumanScan). Windows ±50/100/250/500 kb. Run positive controls (LCT, EDAR, SLC24A5, DARC) to prove the pipeline recovers known signals.</w:t>
+              <w:t xml:space="preserve">Functional / disease-biology annotation (VEP, GWAS Catalog, Open Targets, eQTL). Evidence grading with the graded matrix + red-flag penalties.</w:t>
             </w:r>
           </w:p>
         </w:tc>
@@ -1633,7 +1598,7 @@
                 <w:sz w:val="19"/>
                 <w:szCs w:val="19"/>
               </w:rPr>
-              <w:t xml:space="preserve">Selection-evidence table with windows and caveat flags.</w:t>
+              <w:t xml:space="preserve">One-page reports for the 10 pilot loci; preliminary ranking.</w:t>
             </w:r>
           </w:p>
         </w:tc>
@@ -1704,7 +1669,7 @@
                 <w:sz w:val="19"/>
                 <w:szCs w:val="19"/>
               </w:rPr>
-              <w:t xml:space="preserve">Functional / disease-biology annotation (VEP, GWAS Catalog, Open Targets, eQTL). Evidence grading with the graded matrix + red-flag penalties.</w:t>
+              <w:t xml:space="preserve">Sensitivity analyses (window size, APOE/HLA exclusion, MAF bins, leave-one-resource-out) and the matched-null background prototype.</w:t>
             </w:r>
           </w:p>
         </w:tc>
@@ -1737,7 +1702,7 @@
                 <w:sz w:val="19"/>
                 <w:szCs w:val="19"/>
               </w:rPr>
-              <w:t xml:space="preserve">One-page reports for the 10 pilot loci; preliminary ranking.</w:t>
+              <w:t xml:space="preserve">Sensitivity table; matched-null prototype.</w:t>
             </w:r>
           </w:p>
         </w:tc>
@@ -1808,7 +1773,7 @@
                 <w:sz w:val="19"/>
                 <w:szCs w:val="19"/>
               </w:rPr>
-              <w:t xml:space="preserve">Sensitivity analyses (window size, APOE/HLA exclusion, MAF bins, leave-one-resource-out) and the matched-null background prototype.</w:t>
+              <w:t xml:space="preserve">Scale the full pipeline to all 91 loci; run matched-null enrichment (1,000–10,000 matched sets for stable empirical p-values).</w:t>
             </w:r>
           </w:p>
         </w:tc>
@@ -1841,7 +1806,7 @@
                 <w:sz w:val="19"/>
                 <w:szCs w:val="19"/>
               </w:rPr>
-              <w:t xml:space="preserve">Sensitivity table; matched-null enrichment prototype.</w:t>
+              <w:t xml:space="preserve">Genome-wide enrichment (or locus-prioritization) result.</w:t>
             </w:r>
           </w:p>
         </w:tc>
@@ -1912,7 +1877,7 @@
                 <w:sz w:val="19"/>
                 <w:szCs w:val="19"/>
               </w:rPr>
-              <w:t xml:space="preserve">Write the short pilot report + slides; produce a ranked list of 5–10 loci for follow-up.</w:t>
+              <w:t xml:space="preserve">Write the pilot + scaled report and slides; rank 5–10 loci for follow-up; begin TOPMed/BRAVO validation for rare-variant loci (TREM2, SORL1, ABCA7).</w:t>
             </w:r>
           </w:p>
         </w:tc>
@@ -1945,7 +1910,7 @@
                 <w:sz w:val="19"/>
                 <w:szCs w:val="19"/>
               </w:rPr>
-              <w:t xml:space="preserve">Pilot report and ranked candidate list.</w:t>
+              <w:t xml:space="preserve">Report, ranked candidates, validation started.</w:t>
             </w:r>
           </w:p>
         </w:tc>
@@ -1964,47 +1929,47 @@
         <w:pStyle w:val="Heading2"/>
       </w:pPr>
       <w:r>
-        <w:t xml:space="preserve">Weeks 9–10 (into month two): scale and present</w:t>
-      </w:r>
-    </w:p>
-    <w:p>
-      <w:pPr>
-        <w:pStyle w:val="ListParagraph"/>
-        <w:numPr>
-          <w:ilvl w:val="0"/>
-          <w:numId w:val="2"/>
-        </w:numPr>
-        <w:spacing w:after="60" w:line="264"/>
-      </w:pPr>
-      <w:r>
-        <w:rPr>
-          <w:b/>
-          <w:bCs/>
-        </w:rPr>
-        <w:t xml:space="preserve">Scale the pipeline from 10 pilot loci to all 91 </w:t>
-      </w:r>
-      <w:r>
-        <w:t xml:space="preserve">AD/ADRD loci once the workflow is proven.</w:t>
-      </w:r>
-    </w:p>
-    <w:p>
-      <w:pPr>
-        <w:pStyle w:val="ListParagraph"/>
-        <w:numPr>
-          <w:ilvl w:val="0"/>
-          <w:numId w:val="2"/>
-        </w:numPr>
-        <w:spacing w:after="60" w:line="264"/>
-      </w:pPr>
-      <w:r>
-        <w:rPr>
-          <w:b/>
-          <w:bCs/>
-        </w:rPr>
-        <w:t xml:space="preserve">Run the matched-null enrichment across all 91 </w:t>
-      </w:r>
-      <w:r>
-        <w:t xml:space="preserve">(aim for 1,000–10,000 matched sets for stable empirical p-values).</w:t>
+        <w:t xml:space="preserve">Weeks 9–10 (into month two): start the modern toolkit early</w:t>
+      </w:r>
+    </w:p>
+    <w:p>
+      <w:pPr>
+        <w:pStyle w:val="ListParagraph"/>
+        <w:numPr>
+          <w:ilvl w:val="0"/>
+          <w:numId w:val="2"/>
+        </w:numPr>
+        <w:spacing w:after="60" w:line="264"/>
+      </w:pPr>
+      <w:r>
+        <w:rPr>
+          <w:b/>
+          <w:bCs/>
+        </w:rPr>
+        <w:t xml:space="preserve">Because you’re ahead, begin hands-on ARG / coalescent tools </w:t>
+      </w:r>
+      <w:r>
+        <w:t xml:space="preserve">(Relate, tsinfer/tsdate) and a first demographic-inference run (dadi or PSMC/MSMC) on your data — normally a months-3–6 task.</w:t>
+      </w:r>
+    </w:p>
+    <w:p>
+      <w:pPr>
+        <w:pStyle w:val="ListParagraph"/>
+        <w:numPr>
+          <w:ilvl w:val="0"/>
+          <w:numId w:val="2"/>
+        </w:numPr>
+        <w:spacing w:after="60" w:line="264"/>
+      </w:pPr>
+      <w:r>
+        <w:rPr>
+          <w:b/>
+          <w:bCs/>
+        </w:rPr>
+        <w:t xml:space="preserve">Deepen TOPMed/BRAVO validation </w:t>
+      </w:r>
+      <w:r>
+        <w:t xml:space="preserve">for the rare-variant loci and finalize the ranked candidate list.</w:t>
       </w:r>
     </w:p>
     <w:p>
@@ -2024,7 +1989,7 @@
         <w:t xml:space="preserve">Present the pilot to your lab </w:t>
       </w:r>
       <w:r>
-        <w:t xml:space="preserve">and begin TOPMed/BRAVO validation for the rare-variant loci (TREM2, SORL1, ABCA7).</w:t>
+        <w:t xml:space="preserve">and fold feedback into the next-stage plan.</w:t>
       </w:r>
     </w:p>
     <w:p>
@@ -2088,7 +2053,7 @@
               <w:spacing w:after="0"/>
             </w:pPr>
             <w:r>
-              <w:t xml:space="preserve">A reproducible pipeline; the pilot complete and scaled to 91; genuine fluency with the core statistics and tools; data-access approvals moving; and your first lab presentation delivered.</w:t>
+              <w:t xml:space="preserve">A reproducible pipeline; the pilot complete and scaled to all 91; genuine fluency with the core statistics and tools; data-access approvals moving; your first lab presentation delivered; and the modern ARG / demographic toolkit already underway.</w:t>
             </w:r>
           </w:p>
         </w:tc>
@@ -2615,6 +2580,21 @@
       </w:pPr>
       <w:r>
         <w:t xml:space="preserve">Reading list quick reference</w:t>
+      </w:r>
+    </w:p>
+    <w:p>
+      <w:pPr>
+        <w:spacing w:after="120" w:line="276"/>
+      </w:pPr>
+      <w:r>
+        <w:rPr>
+          <w:b/>
+          <w:bCs/>
+        </w:rPr>
+        <w:t xml:space="preserve">You’ve completed the population-genetics primer</w:t>
+      </w:r>
+      <w:r>
+        <w:t xml:space="preserve">, so the three core papers below are your priority. The foundational items are optional reference — reach for them only to shore up a specific gap.</w:t>
       </w:r>
     </w:p>
     <w:p>

</xml_diff>